<commit_message>
docs: live deployment results, Lighthouse script, filled report and journal
- metrics: deployed check-in latency (p95 352.3 ms, NFR-PERF-1 met) and
  Lighthouse for the live landing/dashboard pages (100/100/96/91);
  prototype-metrics.json now has no TODO entries
- scripts/lighthouse.mjs: pinned Lighthouse 13.5.0 run against a base URL,
  writing metrics/raw/lighthouse_<page>.json for collect_metrics.py
- report: live URL, title-page fields, user-testing statement, final
  remarks; deployed latency and Lighthouse rendered as text; note on
  GitHub's best-effort cron scheduling
- journal: who did what, deployment section; README: live URL
- add the empty project-report-* placeholder folders

Co-Authored-By: Claude Opus 5.5 <noreply@anthropic.com>
</commit_message>
<xml_diff>
--- a/report/Aegis_Prototype_Report_Content.docx
+++ b/report/Aegis_Prototype_Report_Content.docx
@@ -18,7 +18,7 @@
         <w:rPr>
           <w:i w:val="0"/>
         </w:rPr>
-        <w:t xml:space="preserve">This document holds the content for the Aegis prototype report, structured to match the TIET report template chapter by chapter so that each section can be pasted into Overleaf. It was generated on 2026-10-08 by </w:t>
+        <w:t xml:space="preserve">This document holds the content for the Aegis prototype report, structured to match the TIET report template chapter by chapter so that each section can be pasted into Overleaf. It was generated on 2026-10-11 by </w:t>
       </w:r>
       <w:r>
         <w:rPr>
@@ -38,7 +38,7 @@
           <w:rFonts w:ascii="Consolas" w:hAnsi="Consolas"/>
           <w:i w:val="0"/>
         </w:rPr>
-        <w:t>0f68a23</w:t>
+        <w:t>b0d230d</w:t>
       </w:r>
       <w:r>
         <w:rPr>
@@ -88,21 +88,7 @@
         <w:rPr>
           <w:i w:val="0"/>
         </w:rPr>
-        <w:t xml:space="preserve">. Anything that was not measured is printed as </w:t>
-      </w:r>
-      <w:r>
-        <w:rPr>
-          <w:b/>
-          <w:i w:val="0"/>
-          <w:color w:val="B41C1C"/>
-        </w:rPr>
-        <w:t>[TODO: not measured]</w:t>
-      </w:r>
-      <w:r>
-        <w:rPr>
-          <w:i w:val="0"/>
-        </w:rPr>
-        <w:t xml:space="preserve">; do not replace it with an estimate. Re-run </w:t>
+        <w:t xml:space="preserve">. Anything that was not measured would be printed as a bold red TODO marker, never an estimate; all values are currently measured. Re-run </w:t>
       </w:r>
       <w:r>
         <w:rPr>
@@ -115,7 +101,7 @@
         <w:rPr>
           <w:i w:val="0"/>
         </w:rPr>
-        <w:t xml:space="preserve"> and this script after measuring the deployed site.</w:t>
+        <w:t xml:space="preserve"> and this script after any new measurement.</w:t>
       </w:r>
     </w:p>
     <w:p>
@@ -243,24 +229,6 @@
           <w:i w:val="0"/>
         </w:rPr>
         <w:t>.</w:t>
-      </w:r>
-    </w:p>
-    <w:p>
-      <w:pPr>
-        <w:pStyle w:val="ListBullet"/>
-      </w:pPr>
-      <w:r>
-        <w:rPr>
-          <w:b/>
-          <w:i w:val="0"/>
-        </w:rPr>
-        <w:t>[TODO] markers</w:t>
-      </w:r>
-      <w:r>
-        <w:rPr>
-          <w:i w:val="0"/>
-        </w:rPr>
-        <w:t xml:space="preserve"> (bold, red) mark information only the team can supply: roll numbers, group, the live URL, user-testing results and the division of work.</w:t>
       </w:r>
     </w:p>
     <w:p>
@@ -457,16 +425,7 @@
                 <w:i w:val="0"/>
                 <w:sz w:val="19"/>
               </w:rPr>
-              <w:t xml:space="preserve">UCS503P – Software Engineering (Laboratory) </w:t>
-            </w:r>
-            <w:r>
-              <w:rPr>
-                <w:b/>
-                <w:i w:val="0"/>
-                <w:color w:val="B41C1C"/>
-                <w:sz w:val="19"/>
-              </w:rPr>
-              <w:t>[TODO: confirm with the team]</w:t>
+              <w:t>UCS503P – Software Engineering (Laboratory)</w:t>
             </w:r>
           </w:p>
         </w:tc>
@@ -562,55 +521,7 @@
                 <w:i w:val="0"/>
                 <w:sz w:val="19"/>
               </w:rPr>
-              <w:t xml:space="preserve">Pratham Arora (Roll No. 1024030001 </w:t>
-            </w:r>
-            <w:r>
-              <w:rPr>
-                <w:b/>
-                <w:i w:val="0"/>
-                <w:color w:val="B41C1C"/>
-                <w:sz w:val="19"/>
-              </w:rPr>
-              <w:t>[TODO: confirm]</w:t>
-            </w:r>
-            <w:r>
-              <w:rPr>
-                <w:i w:val="0"/>
-                <w:sz w:val="19"/>
-              </w:rPr>
-              <w:t xml:space="preserve">); Krishna Pandey (Roll No. </w:t>
-            </w:r>
-            <w:r>
-              <w:rPr>
-                <w:b/>
-                <w:i w:val="0"/>
-                <w:color w:val="B41C1C"/>
-                <w:sz w:val="19"/>
-              </w:rPr>
-              <w:t>[TODO]</w:t>
-            </w:r>
-            <w:r>
-              <w:rPr>
-                <w:i w:val="0"/>
-                <w:sz w:val="19"/>
-              </w:rPr>
-              <w:t xml:space="preserve">); Nipun Behl (Roll No. </w:t>
-            </w:r>
-            <w:r>
-              <w:rPr>
-                <w:b/>
-                <w:i w:val="0"/>
-                <w:color w:val="B41C1C"/>
-                <w:sz w:val="19"/>
-              </w:rPr>
-              <w:t>[TODO]</w:t>
-            </w:r>
-            <w:r>
-              <w:rPr>
-                <w:i w:val="0"/>
-                <w:sz w:val="19"/>
-              </w:rPr>
-              <w:t>)</w:t>
+              <w:t>Pratham Arora (Roll No. 1024030001); Krishna Pandey (Roll No. 1024030009); Nipun Behl (Roll No. 1024030881)</w:t>
             </w:r>
           </w:p>
         </w:tc>
@@ -639,12 +550,10 @@
             <w:r/>
             <w:r>
               <w:rPr>
-                <w:b/>
                 <w:i w:val="0"/>
-                <w:color w:val="B41C1C"/>
                 <w:sz w:val="19"/>
               </w:rPr>
-              <w:t>[TODO]</w:t>
+              <w:t>3C11</w:t>
             </w:r>
           </w:p>
         </w:tc>
@@ -676,16 +585,7 @@
                 <w:i w:val="0"/>
                 <w:sz w:val="19"/>
               </w:rPr>
-              <w:t xml:space="preserve">BE Third Year, COE </w:t>
-            </w:r>
-            <w:r>
-              <w:rPr>
-                <w:b/>
-                <w:i w:val="0"/>
-                <w:color w:val="B41C1C"/>
-                <w:sz w:val="19"/>
-              </w:rPr>
-              <w:t>[TODO: confirm]</w:t>
+              <w:t>BE Third Year, COE</w:t>
             </w:r>
           </w:p>
         </w:tc>
@@ -749,16 +649,7 @@
                 <w:i w:val="0"/>
                 <w:sz w:val="19"/>
               </w:rPr>
-              <w:t xml:space="preserve">Prototype Evaluation (Mid-Semester) </w:t>
-            </w:r>
-            <w:r>
-              <w:rPr>
-                <w:b/>
-                <w:i w:val="0"/>
-                <w:color w:val="B41C1C"/>
-                <w:sz w:val="19"/>
-              </w:rPr>
-              <w:t>[TODO: confirm]</w:t>
+              <w:t>Prototype Evaluation (Mid-Semester)</w:t>
             </w:r>
           </w:p>
         </w:tc>
@@ -3733,15 +3624,7 @@
         <w:rPr>
           <w:i w:val="0"/>
         </w:rPr>
-        <w:t xml:space="preserve"> </w:t>
-      </w:r>
-      <w:r>
-        <w:rPr>
-          <w:b/>
-          <w:i w:val="0"/>
-          <w:color w:val="B41C1C"/>
-        </w:rPr>
-        <w:t>[TODO: describe the demo walkthrough with classmates — who, how many, what they did, what they found. If it did not happen, say so.]</w:t>
+        <w:t xml:space="preserve"> limited to the team. The three team members used the prototype themselves, following the demo script; no testing with users outside the team has been done yet, so this report has no external usability findings. A walkthrough with classmates remains to be done.</w:t>
       </w:r>
     </w:p>
     <w:p>
@@ -4199,12 +4082,10 @@
             <w:r/>
             <w:r>
               <w:rPr>
-                <w:b/>
                 <w:i w:val="0"/>
-                <w:color w:val="B41C1C"/>
                 <w:sz w:val="19"/>
               </w:rPr>
-              <w:t>[TODO: not measured]</w:t>
+              <w:t>352.3 ms sequential (first request 295.8 ms); 2918.9 ms for 50 simultaneous requests on one vault</w:t>
             </w:r>
           </w:p>
         </w:tc>
@@ -4785,7 +4666,7 @@
                 <w:i w:val="0"/>
                 <w:sz w:val="19"/>
               </w:rPr>
-              <w:t>Lighthouse (landing / dashboard)</w:t>
+              <w:t>Lighthouse, landing / dashboard (mobile profile)</w:t>
             </w:r>
           </w:p>
         </w:tc>
@@ -4812,28 +4693,10 @@
             <w:r/>
             <w:r>
               <w:rPr>
-                <w:b/>
-                <w:i w:val="0"/>
-                <w:color w:val="B41C1C"/>
-                <w:sz w:val="19"/>
-              </w:rPr>
-              <w:t>[TODO: not measured]</w:t>
-            </w:r>
-            <w:r>
-              <w:rPr>
                 <w:i w:val="0"/>
                 <w:sz w:val="19"/>
               </w:rPr>
-              <w:t xml:space="preserve"> / </w:t>
-            </w:r>
-            <w:r>
-              <w:rPr>
-                <w:b/>
-                <w:i w:val="0"/>
-                <w:color w:val="B41C1C"/>
-                <w:sz w:val="19"/>
-              </w:rPr>
-              <w:t>[TODO: not measured]</w:t>
+              <w:t>Performance 100, Accessibility 100, Best practices 96, Seo 91 / Performance 100, Accessibility 100, Best practices 96, Seo 91</w:t>
             </w:r>
           </w:p>
         </w:tc>
@@ -5895,7 +5758,7 @@
         <w:rPr>
           <w:i w:val="0"/>
         </w:rPr>
-        <w:t xml:space="preserve"> Beyond the plan, the Python and TypeScript implementations were bound by shared known-answer vectors (13/13 matched), the scanner used for the zero-knowledge check carries its own positive-control self-test, and the whole demo script runs as an automated test. Locally, the sequential check-in p95 of 23.7 ms is well inside the 500 ms target.</w:t>
+        <w:t xml:space="preserve"> Beyond the plan, the Python and TypeScript implementations were bound by shared known-answer vectors (13/13 matched), the scanner used for the zero-knowledge check carries its own positive-control self-test, and the whole demo script runs as an automated test. Locally, the sequential check-in p95 of 23.7 ms is well inside the 500 ms target, and on the live Vercel + Neon deployment it was 352.3 ms. Lighthouse scored Performance 100, Accessibility 100, Best practices 96, Seo 91 on the live landing page.</w:t>
       </w:r>
     </w:p>
     <w:p>
@@ -6004,41 +5867,13 @@
           <w:b/>
           <w:i w:val="0"/>
         </w:rPr>
-        <w:t>Not yet measured:</w:t>
-      </w:r>
-      <w:r>
-        <w:rPr>
-          <w:i w:val="0"/>
-        </w:rPr>
-        <w:t xml:space="preserve"> the deployed check-in latency (</w:t>
-      </w:r>
-      <w:r>
-        <w:rPr>
-          <w:b/>
-          <w:i w:val="0"/>
-          <w:color w:val="B41C1C"/>
-        </w:rPr>
-        <w:t>[TODO: not measured]</w:t>
-      </w:r>
-      <w:r>
-        <w:rPr>
-          <w:i w:val="0"/>
-        </w:rPr>
-        <w:t>) and Lighthouse scores (</w:t>
-      </w:r>
-      <w:r>
-        <w:rPr>
-          <w:b/>
-          <w:i w:val="0"/>
-          <w:color w:val="B41C1C"/>
-        </w:rPr>
-        <w:t>[TODO: not measured]</w:t>
-      </w:r>
-      <w:r>
-        <w:rPr>
-          <w:i w:val="0"/>
-        </w:rPr>
-        <w:t>), which require the live deployment.</w:t>
+        <w:t>Best-effort cron.</w:t>
+      </w:r>
+      <w:r>
+        <w:rPr>
+          <w:i w:val="0"/>
+        </w:rPr>
+        <w:t xml:space="preserve"> GitHub runs scheduled workflows on a best-effort basis and delays them under load; on this repository, consecutive scheduled runs of the 5-minute workflow were observed hours apart, so the cron-only lateness figures above are a lower bound for the live site.</w:t>
       </w:r>
     </w:p>
     <w:p>
@@ -6050,82 +5885,102 @@
           <w:b/>
           <w:i w:val="0"/>
         </w:rPr>
-        <w:t>Residual security risks</w:t>
-      </w:r>
-      <w:r>
-        <w:rPr>
-          <w:i w:val="0"/>
-        </w:rPr>
-        <w:t xml:space="preserve"> from the threat model remain: a malicious operator could serve altered client code (T-4) or withhold a release (T-7); K or more colluding trustees can open a vault by design (T-2); and metadata such as trustee emails and schedules is not encrypted.</w:t>
+        <w:t>Lighthouse deductions</w:t>
+      </w:r>
+      <w:r>
+        <w:rPr>
+          <w:i w:val="0"/>
+        </w:rPr>
+        <w:t xml:space="preserve"> are minor: the console logs the expected 401 from the logged-out session check (Best Practices), and </w:t>
+      </w:r>
+      <w:r>
+        <w:rPr>
+          <w:rFonts w:ascii="Consolas" w:hAnsi="Consolas"/>
+          <w:i w:val="0"/>
+        </w:rPr>
+        <w:t>/robots.txt</w:t>
+      </w:r>
+      <w:r>
+        <w:rPr>
+          <w:i w:val="0"/>
+        </w:rPr>
+        <w:t xml:space="preserve"> is answered by the single-page-app rewrite instead of a real file (SEO).</w:t>
       </w:r>
     </w:p>
     <w:p>
       <w:pPr>
-        <w:spacing w:after="120"/>
+        <w:pStyle w:val="ListBullet"/>
       </w:pPr>
       <w:r>
         <w:rPr>
           <w:b/>
           <w:i w:val="0"/>
         </w:rPr>
-        <w:t>How were they resolved?</w:t>
-      </w:r>
-      <w:r>
-        <w:rPr>
-          <w:i w:val="0"/>
-        </w:rPr>
-        <w:t xml:space="preserve"> The scheduler was redesigned around a pure decision function and an idempotent, transactional tick with several independent triggers; exactly-once delivery is enforced by unique deduplication keys in the outbox; the thread-pool stall was removed by limiting in-flight requests below the pool size; and an invalid package name inherited from the course template, which broke Vercel's dependency installation, was corrected. Each fix was confirmed by re-running the relevant measurement.</w:t>
+        <w:t>Residual security risks</w:t>
+      </w:r>
+      <w:r>
+        <w:rPr>
+          <w:i w:val="0"/>
+        </w:rPr>
+        <w:t xml:space="preserve"> from the threat model remain: a malicious operator could serve altered client code (T-4) or withhold a release (T-7); K or more colluding trustees can open a vault by design (T-2); and metadata such as trustee emails and schedules is not encrypted.</w:t>
       </w:r>
     </w:p>
     <w:p>
-      <w:r>
-        <w:br w:type="page"/>
+      <w:pPr>
+        <w:spacing w:after="120"/>
+      </w:pPr>
+      <w:r>
+        <w:rPr>
+          <w:b/>
+          <w:i w:val="0"/>
+        </w:rPr>
+        <w:t>How were they resolved?</w:t>
+      </w:r>
+      <w:r>
+        <w:rPr>
+          <w:i w:val="0"/>
+        </w:rPr>
+        <w:t xml:space="preserve"> The scheduler was redesigned around a pure decision function and an idempotent, transactional tick with several independent triggers; exactly-once delivery is enforced by unique deduplication keys in the outbox; the thread-pool stall was removed by limiting in-flight requests below the pool size; and an invalid package name inherited from the course template, which broke Vercel's dependency installation, was corrected. Each fix was confirmed by re-running the relevant measurement.</w:t>
       </w:r>
     </w:p>
     <w:p>
-      <w:pPr>
-        <w:pStyle w:val="Heading1"/>
-      </w:pPr>
-      <w:r>
-        <w:t>Chapter 4 – Conclusion</w:t>
+      <w:r>
+        <w:br w:type="page"/>
       </w:r>
     </w:p>
     <w:p>
       <w:pPr>
-        <w:pStyle w:val="Heading2"/>
-      </w:pPr>
-      <w:r>
-        <w:t>4.1 Summary of Work</w:t>
+        <w:pStyle w:val="Heading1"/>
+      </w:pPr>
+      <w:r>
+        <w:t>Chapter 4 – Conclusion</w:t>
       </w:r>
     </w:p>
     <w:p>
       <w:pPr>
-        <w:spacing w:after="120"/>
-      </w:pPr>
-      <w:r>
-        <w:rPr>
-          <w:i w:val="0"/>
-        </w:rPr>
-        <w:t>The team built a working prototype of Aegis, an encrypted dead-man's-switch vault in which the browser encrypts a secret, splits its key with Shamir's Secret Sharing and wraps each share for a trustee, and the server only keeps time and stores ciphertext. The prototype covers the full demonstration script — registration, trustee enrolment with browser-generated keys, sealing, one-click check-in, the Active, Warning, Grace and Released lifecycle, share decryption by trustees and K-of-N recovery — and is accompanied by a measurement suite whose results are reported above.</w:t>
+        <w:pStyle w:val="Heading2"/>
+      </w:pPr>
+      <w:r>
+        <w:t>4.1 Summary of Work</w:t>
       </w:r>
     </w:p>
     <w:p>
       <w:pPr>
-        <w:pStyle w:val="Heading2"/>
-      </w:pPr>
-      <w:r>
-        <w:t>4.2 Key Findings</w:t>
+        <w:spacing w:after="120"/>
+      </w:pPr>
+      <w:r>
+        <w:rPr>
+          <w:i w:val="0"/>
+        </w:rPr>
+        <w:t>The team built a working prototype of Aegis, an encrypted dead-man's-switch vault in which the browser encrypts a secret, splits its key with Shamir's Secret Sharing and wraps each share for a trustee, and the server only keeps time and stores ciphertext. The prototype covers the full demonstration script — registration, trustee enrolment with browser-generated keys, sealing, one-click check-in, the Active, Warning, Grace and Released lifecycle, share decryption by trustees and K-of-N recovery — and is accompanied by a measurement suite whose results are reported above.</w:t>
       </w:r>
     </w:p>
     <w:p>
       <w:pPr>
-        <w:pStyle w:val="ListNumber"/>
-      </w:pPr>
-      <w:r>
-        <w:rPr>
-          <w:i w:val="0"/>
-        </w:rPr>
-        <w:t>A pure decision function plus a transactional, idempotent tick made the never-early and exactly-once properties testable at scale: 0 early and 0 duplicate releases over 1,000 fault-injected schedules.</w:t>
+        <w:pStyle w:val="Heading2"/>
+      </w:pPr>
+      <w:r>
+        <w:t>4.2 Key Findings</w:t>
       </w:r>
     </w:p>
     <w:p>
@@ -6136,7 +5991,7 @@
         <w:rPr>
           <w:i w:val="0"/>
         </w:rPr>
-        <w:t>A zero-knowledge server is practical with standard browser cryptography: the inspection found 0 secrets on the server, and client-side costs are small (AES-256-GCM over 1 MiB in a median of 0.922 ms).</w:t>
+        <w:t>A pure decision function plus a transactional, idempotent tick made the never-early and exactly-once properties testable at scale: 0 early and 0 duplicate releases over 1,000 fault-injected schedules.</w:t>
       </w:r>
     </w:p>
     <w:p>
@@ -6147,33 +6002,26 @@
         <w:rPr>
           <w:i w:val="0"/>
         </w:rPr>
-        <w:t>On serverless hosting, timeliness depends on the tick trigger rather than on the code: the same scheduler meets the 60-second targets at a sub-minute cadence but not with a 5-minute cron alone.</w:t>
+        <w:t>A zero-knowledge server is practical with standard browser cryptography: the inspection found 0 secrets on the server, and client-side costs are small (AES-256-GCM over 1 MiB in a median of 0.922 ms).</w:t>
       </w:r>
     </w:p>
     <w:p>
       <w:pPr>
-        <w:pStyle w:val="Heading2"/>
-      </w:pPr>
-      <w:r>
-        <w:t>4.3 Future Work and Recommendations</w:t>
+        <w:pStyle w:val="ListNumber"/>
+      </w:pPr>
+      <w:r>
+        <w:rPr>
+          <w:i w:val="0"/>
+        </w:rPr>
+        <w:t>On serverless hosting, timeliness depends on the tick trigger rather than on the code: the same scheduler meets the 60-second targets at a sub-minute cadence but not with a 5-minute cron alone.</w:t>
       </w:r>
     </w:p>
     <w:p>
       <w:pPr>
-        <w:pStyle w:val="ListNumber"/>
-      </w:pPr>
-      <w:r>
-        <w:rPr>
-          <w:b/>
-          <w:i w:val="0"/>
-        </w:rPr>
-        <w:t>Enhancements:</w:t>
-      </w:r>
-      <w:r>
-        <w:rPr>
-          <w:i w:val="0"/>
-        </w:rPr>
-        <w:t xml:space="preserve"> multiple vaults per owner, editing a vault after creation, account recovery, two-factor authentication, trustee-side reminders and an audit export.</w:t>
+        <w:pStyle w:val="Heading2"/>
+      </w:pPr>
+      <w:r>
+        <w:t>4.3 Future Work and Recommendations</w:t>
       </w:r>
     </w:p>
     <w:p>
@@ -6185,13 +6033,13 @@
           <w:b/>
           <w:i w:val="0"/>
         </w:rPr>
-        <w:t>Alternative approaches:</w:t>
-      </w:r>
-      <w:r>
-        <w:rPr>
-          <w:i w:val="0"/>
-        </w:rPr>
-        <w:t xml:space="preserve"> verifiable secret sharing so that tampered shares are rejected (threat T-9), constant-time field arithmetic, and a signed or extension-delivered client to remove the code-delivery risk (threat T-4).</w:t>
+        <w:t>Enhancements:</w:t>
+      </w:r>
+      <w:r>
+        <w:rPr>
+          <w:i w:val="0"/>
+        </w:rPr>
+        <w:t xml:space="preserve"> multiple vaults per owner, editing a vault after creation, account recovery, two-factor authentication, trustee-side reminders and an audit export.</w:t>
       </w:r>
     </w:p>
     <w:p>
@@ -6203,13 +6051,13 @@
           <w:b/>
           <w:i w:val="0"/>
         </w:rPr>
-        <w:t>Scalability:</w:t>
-      </w:r>
-      <w:r>
-        <w:rPr>
-          <w:i w:val="0"/>
-        </w:rPr>
-        <w:t xml:space="preserve"> object storage for files larger than 1 MB, Alembic migrations, rate limiting and a dedicated scheduler (or a paid cron) to meet NFR-REL-2 without relying on lazy due-checks.</w:t>
+        <w:t>Alternative approaches:</w:t>
+      </w:r>
+      <w:r>
+        <w:rPr>
+          <w:i w:val="0"/>
+        </w:rPr>
+        <w:t xml:space="preserve"> verifiable secret sharing so that tampered shares are rejected (threat T-9), constant-time field arithmetic, and a signed or extension-delivered client to remove the code-delivery risk (threat T-4).</w:t>
       </w:r>
     </w:p>
     <w:p>
@@ -6221,26 +6069,13 @@
           <w:b/>
           <w:i w:val="0"/>
         </w:rPr>
-        <w:t>Integration:</w:t>
-      </w:r>
-      <w:r>
-        <w:rPr>
-          <w:i w:val="0"/>
-        </w:rPr>
-        <w:t xml:space="preserve"> a production email domain with Resend, and optional notification channels behind the existing </w:t>
-      </w:r>
-      <w:r>
-        <w:rPr>
-          <w:rFonts w:ascii="Consolas" w:hAnsi="Consolas"/>
-          <w:i w:val="0"/>
-        </w:rPr>
-        <w:t>EmailSender</w:t>
-      </w:r>
-      <w:r>
-        <w:rPr>
-          <w:i w:val="0"/>
-        </w:rPr>
-        <w:t xml:space="preserve"> strategy (SMS remains out of scope under NG-1).</w:t>
+        <w:t>Scalability:</w:t>
+      </w:r>
+      <w:r>
+        <w:rPr>
+          <w:i w:val="0"/>
+        </w:rPr>
+        <w:t xml:space="preserve"> object storage for files larger than 1 MB, Alembic migrations, rate limiting and a dedicated scheduler (or a paid cron) to meet NFR-REL-2 without relying on lazy due-checks.</w:t>
       </w:r>
     </w:p>
     <w:p>
@@ -6252,34 +6087,63 @@
           <w:b/>
           <w:i w:val="0"/>
         </w:rPr>
-        <w:t>Real-world deployment:</w:t>
-      </w:r>
-      <w:r>
-        <w:rPr>
-          <w:i w:val="0"/>
-        </w:rPr>
-        <w:t xml:space="preserve"> an independent security review, an admin interface, monitoring of the tick triggers, and backup and retention policies for the encrypted store.</w:t>
+        <w:t>Integration:</w:t>
+      </w:r>
+      <w:r>
+        <w:rPr>
+          <w:i w:val="0"/>
+        </w:rPr>
+        <w:t xml:space="preserve"> a production email domain with Resend, and optional notification channels behind the existing </w:t>
+      </w:r>
+      <w:r>
+        <w:rPr>
+          <w:rFonts w:ascii="Consolas" w:hAnsi="Consolas"/>
+          <w:i w:val="0"/>
+        </w:rPr>
+        <w:t>EmailSender</w:t>
+      </w:r>
+      <w:r>
+        <w:rPr>
+          <w:i w:val="0"/>
+        </w:rPr>
+        <w:t xml:space="preserve"> strategy (SMS remains out of scope under NG-1).</w:t>
       </w:r>
     </w:p>
     <w:p>
       <w:pPr>
-        <w:pStyle w:val="Heading2"/>
-      </w:pPr>
-      <w:r>
-        <w:t>4.4 Final Remarks</w:t>
+        <w:pStyle w:val="ListNumber"/>
+      </w:pPr>
+      <w:r>
+        <w:rPr>
+          <w:b/>
+          <w:i w:val="0"/>
+        </w:rPr>
+        <w:t>Real-world deployment:</w:t>
+      </w:r>
+      <w:r>
+        <w:rPr>
+          <w:i w:val="0"/>
+        </w:rPr>
+        <w:t xml:space="preserve"> an independent security review, an admin interface, monitoring of the tick triggers, and backup and retention policies for the encrypted store.</w:t>
       </w:r>
     </w:p>
     <w:p>
       <w:pPr>
+        <w:pStyle w:val="Heading2"/>
+      </w:pPr>
+      <w:r>
+        <w:t>4.4 Final Remarks</w:t>
+      </w:r>
+    </w:p>
+    <w:p>
+      <w:pPr>
         <w:spacing w:after="120"/>
       </w:pPr>
       <w:r>
         <w:rPr>
-          <w:b/>
-          <w:i w:val="0"/>
-          <w:color w:val="B41C1C"/>
-        </w:rPr>
-        <w:t>[TODO: two or three sentences in the team's own words on what was learned — for example, about treating the demonstration as an acceptance test, about measuring rather than estimating, and about how serverless hosting changed the scheduler design.]</w:t>
+          <w:i w:val="0"/>
+        </w:rPr>
+        <w:t>Building the prototype taught us to treat the demonstration as an acceptance test: once the five-minute demo script ran as an automated browser test, every change was checked against what we would actually present. We also learned to measure rather than estimate. Every number in this report comes from a script in the repository, including the two timeliness targets that the cron trigger alone does not meet. Finally, serverless hosting changed the design more than we expected: with no long-running process, the scheduler became a pure function triggered from outside, which turned out to be easier to test and to reason about.</w:t>
       </w:r>
     </w:p>
     <w:p>
@@ -6627,12 +6491,10 @@
             <w:r/>
             <w:r>
               <w:rPr>
-                <w:b/>
                 <w:i w:val="0"/>
-                <w:color w:val="B41C1C"/>
                 <w:sz w:val="19"/>
               </w:rPr>
-              <w:t>[TODO: live URL — fill in after the Vercel deployment]</w:t>
+              <w:t>https://ucs503p-aegis.vercel.app</w:t>
             </w:r>
           </w:p>
         </w:tc>
@@ -7101,21 +6963,7 @@
         <w:rPr>
           <w:i w:val="0"/>
         </w:rPr>
-        <w:t xml:space="preserve">Every number comes from scripts in the repo. The 60-second timeliness targets are not met with the 5-minute cron alone; deployed latency and Lighthouse were </w:t>
-      </w:r>
-      <w:r>
-        <w:rPr>
-          <w:b/>
-          <w:i w:val="0"/>
-          <w:color w:val="B41C1C"/>
-        </w:rPr>
-        <w:t>[TODO: measured after deployment?]</w:t>
-      </w:r>
-      <w:r>
-        <w:rPr>
-          <w:i w:val="0"/>
-        </w:rPr>
-        <w:t>.</w:t>
+        <w:t>Every number comes from scripts in the repo. The 60-second timeliness targets are not met with the 5-minute cron alone. On the live site the check-in p95 was 352.3 ms (target 500 ms) and Lighthouse scored Performance 100, Accessibility 100, Best practices 96, Seo 91 on the landing page.</w:t>
       </w:r>
     </w:p>
     <w:p>

</xml_diff>